<commit_message>
Final hardening: pure ratio metrics, clarification progress, and Tests A-G verified
</commit_message>
<xml_diff>
--- a/requirement-specification-report.docx
+++ b/requirement-specification-report.docx
@@ -21,7 +21,7 @@
           <w:iCs/>
           <w:color w:val="666666"/>
         </w:rPr>
-        <w:t xml:space="preserve">Generated: 24/8/2026, 9:25:47 pm | Standard: ISO/IEC/IEEE 29148</w:t>
+        <w:t xml:space="preserve">Generated: 24/8/2026, 9:36:04 pm | Standard: ISO/IEC/IEEE 29148</w:t>
       </w:r>
     </w:p>
     <w:p>
@@ -567,7 +567,7 @@
 </w:t>
       </w:r>
       <w:r>
-        <w:t xml:space="preserve">Description: All candidate resumes and personal data must be encrypted at rest using AES-256 and in transit using TLS 1.3, with role-based access control (RBAC) compliant with GDPR and CCPA.
+        <w:t xml:space="preserve">Description: All candidate resumes and personal data must be encrypted at rest using AES-256 and in transit using TLS 1.3, with RBAC compliant with GDPR/CCPA based on data pipeline: Support PDF and DOCX up to 10MB; parse unstructured text into standardized JSON schema (skills, education, work history, projects); run automated data cleaning on historical logs..
 </w:t>
       </w:r>
       <w:r>
@@ -640,7 +640,7 @@
           <w:bCs/>
           <w:color w:val="CC0000"/>
         </w:rPr>
-        <w:t xml:space="preserve">Baseline Score (Without Clarification): 21/100
+        <w:t xml:space="preserve">Baseline Score (Without Clarification): 8/100
 </w:t>
       </w:r>
       <w:r>
@@ -649,15 +649,15 @@
           <w:bCs/>
           <w:color w:val="009900"/>
         </w:rPr>
-        <w:t xml:space="preserve">Refined Score (With AI Clarification): 87/100
-</w:t>
-      </w:r>
-      <w:r>
-        <w:rPr>
-          <w:i/>
-          <w:iCs/>
-        </w:rPr>
-        <w:t xml:space="preserve">Quality Delta: +66 Points improvement across testability, completeness, and precision.</w:t>
+        <w:t xml:space="preserve">Refined Score (With AI Clarification): 96/100
+</w:t>
+      </w:r>
+      <w:r>
+        <w:rPr>
+          <w:i/>
+          <w:iCs/>
+        </w:rPr>
+        <w:t xml:space="preserve">Quality Delta: +88 Points improvement across testability, completeness, and precision.</w:t>
       </w:r>
     </w:p>
     <w:sectPr>

</xml_diff>

<commit_message>
Complete implementation of Master Engineering Prompt with Tests A-K
</commit_message>
<xml_diff>
--- a/requirement-specification-report.docx
+++ b/requirement-specification-report.docx
@@ -21,7 +21,7 @@
           <w:iCs/>
           <w:color w:val="666666"/>
         </w:rPr>
-        <w:t xml:space="preserve">Generated: 24/8/2026, 9:36:04 pm | Standard: ISO/IEC/IEEE 29148</w:t>
+        <w:t xml:space="preserve">Generated: 24/8/2026, 9:42:37 pm | Standard: ISO/IEC/IEEE 29148</w:t>
       </w:r>
     </w:p>
     <w:p>
@@ -319,26 +319,26 @@
           <w:bCs/>
           <w:color w:val="003399"/>
         </w:rPr>
-        <w:t xml:space="preserve">FR-02: Deterministic Multi-Factor Candidate Scoring Engine [Must Have]
-</w:t>
-      </w:r>
-      <w:r>
-        <w:t xml:space="preserve">Description: The system shall calculate composite candidate relevance scores using stakeholder-defined weighting: Anonymize PII and college names before scoring; enforce Disparate Impact Ratio (DIR) between 0.80 and 1.25 across gender and college tiers..
-</w:t>
-      </w:r>
-      <w:r>
-        <w:rPr>
-          <w:i/>
-          <w:iCs/>
-        </w:rPr>
-        <w:t xml:space="preserve">Acceptance Criteria: Given a job description and candidate profile, When scored, Then the final score strictly follows the stakeholder weighting formula. | Given an exceptional fresher with high project complexity, When ranked against generic experience, Then the fresher outranks when composite score is higher.
+        <w:t xml:space="preserve">FR-02: Candidate Scoring (Pending Weighting Formula) [High]
+</w:t>
+      </w:r>
+      <w:r>
+        <w:t xml:space="preserve">Description: The system shall rank candidates based on relevance, skills, and overall profile strength (exact scoring weights pending clarification).
+</w:t>
+      </w:r>
+      <w:r>
+        <w:rPr>
+          <w:i/>
+          <w:iCs/>
+        </w:rPr>
+        <w:t xml:space="preserve">Acceptance Criteria: Candidates are ranked
 </w:t>
       </w:r>
       <w:r>
         <w:rPr>
           <w:color w:val="444444"/>
         </w:rPr>
-        <w:t xml:space="preserve">Verification: Unit Test &amp; Ranking Algorithm Regression Suite
+        <w:t xml:space="preserve">Verification: Automated Test
 </w:t>
       </w:r>
     </w:p>
@@ -356,22 +356,22 @@
 </w:t>
       </w:r>
       <w:r>
-        <w:t xml:space="preserve">Description: The system shall display a candidate match scorecard based on stakeholder specification: Provide a structured breakdown for each candidate: matched required skills %, matched preferred skills %, quantified project score, and 3 bullet justifications for ranking..
-</w:t>
-      </w:r>
-      <w:r>
-        <w:rPr>
-          <w:i/>
-          <w:iCs/>
-        </w:rPr>
-        <w:t xml:space="preserve">Acceptance Criteria: Given any ranked candidate, When clicked by an HR user, Then the system renders a breakdown modal with skills overlap percentage, project badge evaluations, and textual justifications.
+        <w:t xml:space="preserve">Description: The system shall generate an interactive candidate match scorecard satisfying stakeholder preference: Provide a structured breakdown for each candidate: matched required skills %, matched preferred skills %, quantified project score, and 3 bullet justifications for ranking..
+</w:t>
+      </w:r>
+      <w:r>
+        <w:rPr>
+          <w:i/>
+          <w:iCs/>
+        </w:rPr>
+        <w:t xml:space="preserve">Acceptance Criteria: Given a ranked candidate profile, When opened in recruiter UI, Then the system displays matched skill %, project impact score, and top 3 justification reasons. | Given a candidate with missing prerequisite skills, When viewed, Then missing requirements are highlighted in amber.
 </w:t>
       </w:r>
       <w:r>
         <w:rPr>
           <w:color w:val="444444"/>
         </w:rPr>
-        <w:t xml:space="preserve">Verification: UI End-to-End Test &amp; Interpretability Review
+        <w:t xml:space="preserve">Verification: Automated UI/UX Verification &amp; Output Schema Validation
 </w:t>
       </w:r>
     </w:p>
@@ -385,26 +385,26 @@
           <w:bCs/>
           <w:color w:val="003399"/>
         </w:rPr>
-        <w:t xml:space="preserve">FR-04: Batch Resume Screening &amp; Ranked Export [Should Have]
-</w:t>
-      </w:r>
-      <w:r>
-        <w:t xml:space="preserve">Description: The system shall support batch uploads of up to 100 resumes simultaneously, providing real-time progress indicators, automated ranking, and CSV/JSON export capabilities.
-</w:t>
-      </w:r>
-      <w:r>
-        <w:rPr>
-          <w:i/>
-          <w:iCs/>
-        </w:rPr>
-        <w:t xml:space="preserve">Acceptance Criteria: Given a batch upload of up to 100 resumes, When processed, Then the system completes ranking within the specified latency SLO and exports results.
+        <w:t xml:space="preserve">FR-04: Fairness Audit &amp; Demographic Parity Dashboard [Must Have]
+</w:t>
+      </w:r>
+      <w:r>
+        <w:t xml:space="preserve">Description: The system shall execute automated Disparate Impact Ratio audits across gender and college tiers complying with: Anonymize PII and college names before scoring; enforce Disparate Impact Ratio (DIR) between 0.80 and 1.25 across gender and college tiers..
+</w:t>
+      </w:r>
+      <w:r>
+        <w:rPr>
+          <w:i/>
+          <w:iCs/>
+        </w:rPr>
+        <w:t xml:space="preserve">Acceptance Criteria: Given a candidate batch, When analyzed, Then names, gender indicators, and college brand names are redacted prior to feature extraction. | Given batch recommendations, When DIR is below 0.80 or above 1.25, Then the system alerts the compliance team.
 </w:t>
       </w:r>
       <w:r>
         <w:rPr>
           <w:color w:val="444444"/>
         </w:rPr>
-        <w:t xml:space="preserve">Verification: End-to-End Load Testing &amp; Export Integrity Check
+        <w:t xml:space="preserve">Verification: Automated Bias Test Suite on Synthetic Demographic Cohorts
 </w:t>
       </w:r>
     </w:p>
@@ -533,7 +533,7 @@
 </w:t>
       </w:r>
       <w:r>
-        <w:t xml:space="preserve">Description: Explainability attribution weights must achieve 100% fidelity with the scoring formula and render on client side within 200ms based on stakeholder requirement: Provide a structured breakdown for each candidate: matched required skills %, matched preferred skills %, quantified project score, and 3 bullet justifications for ranking..
+        <w:t xml:space="preserve">Description: Explainability attribution weights must achieve 100% fidelity with the scoring formula and render within 200ms based on stakeholder requirement: Provide a structured breakdown for each candidate: matched required skills %, matched preferred skills %, quantified project score, and 3 bullet justifications for ranking..
 </w:t>
       </w:r>
       <w:r>
@@ -649,15 +649,15 @@
           <w:bCs/>
           <w:color w:val="009900"/>
         </w:rPr>
-        <w:t xml:space="preserve">Refined Score (With AI Clarification): 96/100
-</w:t>
-      </w:r>
-      <w:r>
-        <w:rPr>
-          <w:i/>
-          <w:iCs/>
-        </w:rPr>
-        <w:t xml:space="preserve">Quality Delta: +88 Points improvement across testability, completeness, and precision.</w:t>
+        <w:t xml:space="preserve">Refined Score (With AI Clarification): 92/100
+</w:t>
+      </w:r>
+      <w:r>
+        <w:rPr>
+          <w:i/>
+          <w:iCs/>
+        </w:rPr>
+        <w:t xml:space="preserve">Quality Delta: +84 Points improvement across testability, completeness, and precision.</w:t>
       </w:r>
     </w:p>
     <w:sectPr>

</xml_diff>

<commit_message>
Security hardening: escapeHtml, dynamic quality reporting in extension, and regression test suite
</commit_message>
<xml_diff>
--- a/requirement-specification-report.docx
+++ b/requirement-specification-report.docx
@@ -21,7 +21,7 @@
           <w:iCs/>
           <w:color w:val="666666"/>
         </w:rPr>
-        <w:t xml:space="preserve">Generated: 24/8/2026, 9:46:41 pm | Standard: ISO/IEC/IEEE 29148</w:t>
+        <w:t xml:space="preserve">Generated: 24/8/2026, 11:23:55 pm | Standard: ISO/IEC/IEEE 29148</w:t>
       </w:r>
     </w:p>
     <w:p>
@@ -319,26 +319,26 @@
           <w:bCs/>
           <w:color w:val="003399"/>
         </w:rPr>
-        <w:t xml:space="preserve">FR-02: Candidate Scoring (Pending Weighting Formula) [High]
-</w:t>
-      </w:r>
-      <w:r>
-        <w:t xml:space="preserve">Description: The system shall rank candidates based on relevance, skills, and overall profile strength (exact scoring weights pending clarification).
-</w:t>
-      </w:r>
-      <w:r>
-        <w:rPr>
-          <w:i/>
-          <w:iCs/>
-        </w:rPr>
-        <w:t xml:space="preserve">Acceptance Criteria: Candidates are ranked
+        <w:t xml:space="preserve">FR-02: Deterministic Multi-Factor Candidate Scoring Engine [Must Have]
+</w:t>
+      </w:r>
+      <w:r>
+        <w:t xml:space="preserve">Description: The system shall calculate composite candidate relevance scores using stakeholder-defined weighting: Weighting formula: 45% Skill Match &amp; Demonstrated Tech Stack, 35% Project Impact &amp; Scope (open source, deployed apps), 20% Relevant Experience; allow freshers with high project scores to outrank generic profiles..
+</w:t>
+      </w:r>
+      <w:r>
+        <w:rPr>
+          <w:i/>
+          <w:iCs/>
+        </w:rPr>
+        <w:t xml:space="preserve">Acceptance Criteria: Given a job description and candidate profile, When scored, Then the final score strictly follows the stakeholder weighting formula. | Given an exceptional fresher with high project complexity, When ranked against generic experience, Then the fresher outranks when composite score is higher.
 </w:t>
       </w:r>
       <w:r>
         <w:rPr>
           <w:color w:val="444444"/>
         </w:rPr>
-        <w:t xml:space="preserve">Verification: Automated Test
+        <w:t xml:space="preserve">Verification: Unit Test &amp; Ranking Algorithm Regression Suite
 </w:t>
       </w:r>
     </w:p>
@@ -649,15 +649,15 @@
           <w:bCs/>
           <w:color w:val="009900"/>
         </w:rPr>
-        <w:t xml:space="preserve">Refined Score (With AI Clarification): 92/100
-</w:t>
-      </w:r>
-      <w:r>
-        <w:rPr>
-          <w:i/>
-          <w:iCs/>
-        </w:rPr>
-        <w:t xml:space="preserve">Quality Delta: +84 Points improvement across testability, completeness, and precision.</w:t>
+        <w:t xml:space="preserve">Refined Score (With AI Clarification): 100/100
+</w:t>
+      </w:r>
+      <w:r>
+        <w:rPr>
+          <w:i/>
+          <w:iCs/>
+        </w:rPr>
+        <w:t xml:space="preserve">Quality Delta: +92 Points improvement across testability, completeness, and precision.</w:t>
       </w:r>
     </w:p>
     <w:sectPr>

</xml_diff>